<commit_message>
Fill out more documents
</commit_message>
<xml_diff>
--- a/Documents/F2024_WorkBreakdownStructure.docx
+++ b/Documents/F2024_WorkBreakdownStructure.docx
@@ -1,6 +1,6 @@
 
 <file path=word/document.xml><?xml version="1.0" encoding="utf-8"?>
-<w:document xmlns:wpc="http://schemas.microsoft.com/office/word/2010/wordprocessingCanvas" xmlns:cx="http://schemas.microsoft.com/office/drawing/2014/chartex" xmlns:cx1="http://schemas.microsoft.com/office/drawing/2015/9/8/chartex" xmlns:cx2="http://schemas.microsoft.com/office/drawing/2015/10/21/chartex" xmlns:cx3="http://schemas.microsoft.com/office/drawing/2016/5/9/chartex" xmlns:cx4="http://schemas.microsoft.com/office/drawing/2016/5/10/chartex" xmlns:cx5="http://schemas.microsoft.com/office/drawing/2016/5/11/chartex" xmlns:cx6="http://schemas.microsoft.com/office/drawing/2016/5/12/chartex" xmlns:cx7="http://schemas.microsoft.com/office/drawing/2016/5/13/chartex" xmlns:cx8="http://schemas.microsoft.com/office/drawing/2016/5/14/chartex" xmlns:mc="http://schemas.openxmlformats.org/markup-compatibility/2006" xmlns:aink="http://schemas.microsoft.com/office/drawing/2016/ink" xmlns:am3d="http://schemas.microsoft.com/office/drawing/2017/model3d" xmlns:o="urn:schemas-microsoft-com:office:office" xmlns:oel="http://schemas.microsoft.com/office/2019/extlst" xmlns:r="http://schemas.openxmlformats.org/officeDocument/2006/relationships" xmlns:m="http://schemas.openxmlformats.org/officeDocument/2006/math" xmlns:v="urn:schemas-microsoft-com:vml" xmlns:wp14="http://schemas.microsoft.com/office/word/2010/wordprocessingDrawing" xmlns:wp="http://schemas.openxmlformats.org/drawingml/2006/wordprocessingDrawing" xmlns:w10="urn:schemas-microsoft-com:office:word" xmlns:w="http://schemas.openxmlformats.org/wordprocessingml/2006/main" xmlns:w14="http://schemas.microsoft.com/office/word/2010/wordml" xmlns:w15="http://schemas.microsoft.com/office/word/2012/wordml" xmlns:w16cex="http://schemas.microsoft.com/office/word/2018/wordml/cex" xmlns:w16cid="http://schemas.microsoft.com/office/word/2016/wordml/cid" xmlns:w16="http://schemas.microsoft.com/office/word/2018/wordml" xmlns:w16sdtdh="http://schemas.microsoft.com/office/word/2020/wordml/sdtdatahash" xmlns:w16se="http://schemas.microsoft.com/office/word/2015/wordml/symex" xmlns:wpg="http://schemas.microsoft.com/office/word/2010/wordprocessingGroup" xmlns:wpi="http://schemas.microsoft.com/office/word/2010/wordprocessingInk" xmlns:wne="http://schemas.microsoft.com/office/word/2006/wordml" xmlns:wps="http://schemas.microsoft.com/office/word/2010/wordprocessingShape" mc:Ignorable="w14 w15 w16se w16cid w16 w16cex w16sdtdh wp14">
+<w:document xmlns:wpc="http://schemas.microsoft.com/office/word/2010/wordprocessingCanvas" xmlns:cx="http://schemas.microsoft.com/office/drawing/2014/chartex" xmlns:cx1="http://schemas.microsoft.com/office/drawing/2015/9/8/chartex" xmlns:cx2="http://schemas.microsoft.com/office/drawing/2015/10/21/chartex" xmlns:cx3="http://schemas.microsoft.com/office/drawing/2016/5/9/chartex" xmlns:cx4="http://schemas.microsoft.com/office/drawing/2016/5/10/chartex" xmlns:cx5="http://schemas.microsoft.com/office/drawing/2016/5/11/chartex" xmlns:cx6="http://schemas.microsoft.com/office/drawing/2016/5/12/chartex" xmlns:cx7="http://schemas.microsoft.com/office/drawing/2016/5/13/chartex" xmlns:cx8="http://schemas.microsoft.com/office/drawing/2016/5/14/chartex" xmlns:mc="http://schemas.openxmlformats.org/markup-compatibility/2006" xmlns:aink="http://schemas.microsoft.com/office/drawing/2016/ink" xmlns:am3d="http://schemas.microsoft.com/office/drawing/2017/model3d" xmlns:o="urn:schemas-microsoft-com:office:office" xmlns:oel="http://schemas.microsoft.com/office/2019/extlst" xmlns:r="http://schemas.openxmlformats.org/officeDocument/2006/relationships" xmlns:m="http://schemas.openxmlformats.org/officeDocument/2006/math" xmlns:v="urn:schemas-microsoft-com:vml" xmlns:wp14="http://schemas.microsoft.com/office/word/2010/wordprocessingDrawing" xmlns:wp="http://schemas.openxmlformats.org/drawingml/2006/wordprocessingDrawing" xmlns:w10="urn:schemas-microsoft-com:office:word" xmlns:w="http://schemas.openxmlformats.org/wordprocessingml/2006/main" xmlns:w14="http://schemas.microsoft.com/office/word/2010/wordml" xmlns:w15="http://schemas.microsoft.com/office/word/2012/wordml" xmlns:w16cex="http://schemas.microsoft.com/office/word/2018/wordml/cex" xmlns:w16cid="http://schemas.microsoft.com/office/word/2016/wordml/cid" xmlns:w16="http://schemas.microsoft.com/office/word/2018/wordml" xmlns:w16du="http://schemas.microsoft.com/office/word/2023/wordml/word16du" xmlns:w16sdtdh="http://schemas.microsoft.com/office/word/2020/wordml/sdtdatahash" xmlns:w16sdtfl="http://schemas.microsoft.com/office/word/2024/wordml/sdtformatlock" xmlns:w16se="http://schemas.microsoft.com/office/word/2015/wordml/symex" xmlns:wpg="http://schemas.microsoft.com/office/word/2010/wordprocessingGroup" xmlns:wpi="http://schemas.microsoft.com/office/word/2010/wordprocessingInk" xmlns:wne="http://schemas.microsoft.com/office/word/2006/wordml" xmlns:wps="http://schemas.microsoft.com/office/word/2010/wordprocessingShape" mc:Ignorable="w14 w15 w16se w16cid w16 w16cex w16sdtdh w16sdtfl w16du wp14">
   <w:body>
     <w:p>
       <w:pPr>
@@ -244,19 +244,34 @@
           <w:tcPr>
             <w:tcW w:w="1666" w:type="pct"/>
           </w:tcPr>
-          <w:p/>
+          <w:p>
+            <w:r>
+              <w:t>Edin</w:t>
+            </w:r>
+          </w:p>
         </w:tc>
         <w:tc>
           <w:tcPr>
             <w:tcW w:w="1666" w:type="pct"/>
           </w:tcPr>
-          <w:p/>
+          <w:p>
+            <w:r>
+              <w:t xml:space="preserve">Research. </w:t>
+            </w:r>
+            <w:r>
+              <w:t xml:space="preserve">What existing projects are out there? What are their strengths and advantages. What are their shortcoming and weaknesses? </w:t>
+            </w:r>
+          </w:p>
         </w:tc>
         <w:tc>
           <w:tcPr>
             <w:tcW w:w="1667" w:type="pct"/>
           </w:tcPr>
-          <w:p/>
+          <w:p>
+            <w:r>
+              <w:t>18-09-26 10:00</w:t>
+            </w:r>
+          </w:p>
         </w:tc>
       </w:tr>
       <w:tr>
@@ -267,19 +282,37 @@
           <w:tcPr>
             <w:tcW w:w="1666" w:type="pct"/>
           </w:tcPr>
-          <w:p/>
+          <w:p>
+            <w:r>
+              <w:t>Jack</w:t>
+            </w:r>
+          </w:p>
         </w:tc>
         <w:tc>
           <w:tcPr>
             <w:tcW w:w="1666" w:type="pct"/>
           </w:tcPr>
-          <w:p/>
+          <w:p>
+            <w:r>
+              <w:t>Data model covering Quality Inspecter's section based on case docs</w:t>
+            </w:r>
+            <w:r>
+              <w:t xml:space="preserve">. Make an ERD for the </w:t>
+            </w:r>
+            <w:r>
+              <w:t>db covering all edge cases and normal operation.</w:t>
+            </w:r>
+          </w:p>
         </w:tc>
         <w:tc>
           <w:tcPr>
             <w:tcW w:w="1667" w:type="pct"/>
           </w:tcPr>
-          <w:p/>
+          <w:p>
+            <w:r>
+              <w:t>18-09-26 10:00</w:t>
+            </w:r>
+          </w:p>
         </w:tc>
       </w:tr>
       <w:tr>
@@ -290,19 +323,43 @@
           <w:tcPr>
             <w:tcW w:w="1666" w:type="pct"/>
           </w:tcPr>
-          <w:p/>
+          <w:p>
+            <w:r>
+              <w:t>Jake</w:t>
+            </w:r>
+          </w:p>
         </w:tc>
         <w:tc>
           <w:tcPr>
             <w:tcW w:w="1666" w:type="pct"/>
           </w:tcPr>
-          <w:p/>
+          <w:p>
+            <w:r>
+              <w:t>Contract</w:t>
+            </w:r>
+            <w:r>
+              <w:t xml:space="preserve">. Who of us does what, how, </w:t>
+            </w:r>
+            <w:r>
+              <w:t xml:space="preserve">and </w:t>
+            </w:r>
+            <w:r>
+              <w:t>when</w:t>
+            </w:r>
+            <w:r>
+              <w:t>.</w:t>
+            </w:r>
+          </w:p>
         </w:tc>
         <w:tc>
           <w:tcPr>
             <w:tcW w:w="1667" w:type="pct"/>
           </w:tcPr>
-          <w:p/>
+          <w:p>
+            <w:r>
+              <w:t>18-09-26 10:00</w:t>
+            </w:r>
+          </w:p>
         </w:tc>
       </w:tr>
       <w:tr>
@@ -312,20 +369,48 @@
         <w:tc>
           <w:tcPr>
             <w:tcW w:w="1666" w:type="pct"/>
-          </w:tcPr>
-          <w:p/>
+            <w:tcBorders>
+              <w:bottom w:val="single" w:sz="4" w:space="0" w:color="auto"/>
+            </w:tcBorders>
+          </w:tcPr>
+          <w:p>
+            <w:r>
+              <w:lastRenderedPageBreak/>
+              <w:t>Kayla</w:t>
+            </w:r>
+          </w:p>
         </w:tc>
         <w:tc>
           <w:tcPr>
             <w:tcW w:w="1666" w:type="pct"/>
-          </w:tcPr>
-          <w:p/>
+            <w:tcBorders>
+              <w:bottom w:val="single" w:sz="4" w:space="0" w:color="auto"/>
+            </w:tcBorders>
+          </w:tcPr>
+          <w:p>
+            <w:r>
+              <w:t>Team look, colours, logo, etc.</w:t>
+            </w:r>
+            <w:r>
+              <w:t xml:space="preserve"> Styling guide and </w:t>
+            </w:r>
+            <w:r>
+              <w:t>all things appearance/aesthetics.</w:t>
+            </w:r>
+          </w:p>
         </w:tc>
         <w:tc>
           <w:tcPr>
             <w:tcW w:w="1667" w:type="pct"/>
-          </w:tcPr>
-          <w:p/>
+            <w:tcBorders>
+              <w:bottom w:val="single" w:sz="4" w:space="0" w:color="auto"/>
+            </w:tcBorders>
+          </w:tcPr>
+          <w:p>
+            <w:r>
+              <w:t>18-09-26 10:00</w:t>
+            </w:r>
+          </w:p>
         </w:tc>
       </w:tr>
       <w:tr>
@@ -335,20 +420,62 @@
         <w:tc>
           <w:tcPr>
             <w:tcW w:w="1666" w:type="pct"/>
-          </w:tcPr>
-          <w:p/>
+            <w:tcBorders>
+              <w:bottom w:val="single" w:sz="4" w:space="0" w:color="auto"/>
+            </w:tcBorders>
+          </w:tcPr>
+          <w:p>
+            <w:r>
+              <w:t>Steve</w:t>
+            </w:r>
+          </w:p>
         </w:tc>
         <w:tc>
           <w:tcPr>
             <w:tcW w:w="1666" w:type="pct"/>
-          </w:tcPr>
-          <w:p/>
+            <w:tcBorders>
+              <w:bottom w:val="single" w:sz="4" w:space="0" w:color="auto"/>
+            </w:tcBorders>
+          </w:tcPr>
+          <w:p>
+            <w:r>
+              <w:t>Someone will have to bring it all together into a single, coherent, and consistent presentation</w:t>
+            </w:r>
+            <w:r>
+              <w:t xml:space="preserve"> and </w:t>
+            </w:r>
+            <w:r>
+              <w:t>s</w:t>
+            </w:r>
+            <w:r>
+              <w:t>ubmit required doc package before presentation</w:t>
+            </w:r>
+            <w:r>
+              <w:t>. Create presentation and submit it alongside all required and optional documents.</w:t>
+            </w:r>
+          </w:p>
         </w:tc>
         <w:tc>
           <w:tcPr>
             <w:tcW w:w="1667" w:type="pct"/>
-          </w:tcPr>
-          <w:p/>
+            <w:tcBorders>
+              <w:bottom w:val="single" w:sz="4" w:space="0" w:color="auto"/>
+            </w:tcBorders>
+          </w:tcPr>
+          <w:p>
+            <w:r>
+              <w:t>21</w:t>
+            </w:r>
+            <w:r>
+              <w:t xml:space="preserve">-09-26 </w:t>
+            </w:r>
+            <w:r>
+              <w:t>09</w:t>
+            </w:r>
+            <w:r>
+              <w:t>:00</w:t>
+            </w:r>
+          </w:p>
         </w:tc>
       </w:tr>
       <w:tr>
@@ -358,18 +485,36 @@
         <w:tc>
           <w:tcPr>
             <w:tcW w:w="1666" w:type="pct"/>
+            <w:tcBorders>
+              <w:top w:val="single" w:sz="4" w:space="0" w:color="auto"/>
+              <w:left w:val="nil"/>
+              <w:bottom w:val="nil"/>
+              <w:right w:val="nil"/>
+            </w:tcBorders>
           </w:tcPr>
           <w:p/>
         </w:tc>
         <w:tc>
           <w:tcPr>
             <w:tcW w:w="1666" w:type="pct"/>
+            <w:tcBorders>
+              <w:top w:val="single" w:sz="4" w:space="0" w:color="auto"/>
+              <w:left w:val="nil"/>
+              <w:bottom w:val="nil"/>
+              <w:right w:val="nil"/>
+            </w:tcBorders>
           </w:tcPr>
           <w:p/>
         </w:tc>
         <w:tc>
           <w:tcPr>
             <w:tcW w:w="1667" w:type="pct"/>
+            <w:tcBorders>
+              <w:top w:val="single" w:sz="4" w:space="0" w:color="auto"/>
+              <w:left w:val="nil"/>
+              <w:bottom w:val="nil"/>
+              <w:right w:val="nil"/>
+            </w:tcBorders>
           </w:tcPr>
           <w:p/>
         </w:tc>
@@ -388,7 +533,7 @@
 </file>
 
 <file path=word/endnotes.xml><?xml version="1.0" encoding="utf-8"?>
-<w:endnotes xmlns:wpc="http://schemas.microsoft.com/office/word/2010/wordprocessingCanvas" xmlns:cx="http://schemas.microsoft.com/office/drawing/2014/chartex" xmlns:cx1="http://schemas.microsoft.com/office/drawing/2015/9/8/chartex" xmlns:cx2="http://schemas.microsoft.com/office/drawing/2015/10/21/chartex" xmlns:cx3="http://schemas.microsoft.com/office/drawing/2016/5/9/chartex" xmlns:cx4="http://schemas.microsoft.com/office/drawing/2016/5/10/chartex" xmlns:cx5="http://schemas.microsoft.com/office/drawing/2016/5/11/chartex" xmlns:cx6="http://schemas.microsoft.com/office/drawing/2016/5/12/chartex" xmlns:cx7="http://schemas.microsoft.com/office/drawing/2016/5/13/chartex" xmlns:cx8="http://schemas.microsoft.com/office/drawing/2016/5/14/chartex" xmlns:mc="http://schemas.openxmlformats.org/markup-compatibility/2006" xmlns:aink="http://schemas.microsoft.com/office/drawing/2016/ink" xmlns:am3d="http://schemas.microsoft.com/office/drawing/2017/model3d" xmlns:o="urn:schemas-microsoft-com:office:office" xmlns:oel="http://schemas.microsoft.com/office/2019/extlst" xmlns:r="http://schemas.openxmlformats.org/officeDocument/2006/relationships" xmlns:m="http://schemas.openxmlformats.org/officeDocument/2006/math" xmlns:v="urn:schemas-microsoft-com:vml" xmlns:wp14="http://schemas.microsoft.com/office/word/2010/wordprocessingDrawing" xmlns:wp="http://schemas.openxmlformats.org/drawingml/2006/wordprocessingDrawing" xmlns:w10="urn:schemas-microsoft-com:office:word" xmlns:w="http://schemas.openxmlformats.org/wordprocessingml/2006/main" xmlns:w14="http://schemas.microsoft.com/office/word/2010/wordml" xmlns:w15="http://schemas.microsoft.com/office/word/2012/wordml" xmlns:w16cex="http://schemas.microsoft.com/office/word/2018/wordml/cex" xmlns:w16cid="http://schemas.microsoft.com/office/word/2016/wordml/cid" xmlns:w16="http://schemas.microsoft.com/office/word/2018/wordml" xmlns:w16sdtdh="http://schemas.microsoft.com/office/word/2020/wordml/sdtdatahash" xmlns:w16se="http://schemas.microsoft.com/office/word/2015/wordml/symex" xmlns:wpg="http://schemas.microsoft.com/office/word/2010/wordprocessingGroup" xmlns:wpi="http://schemas.microsoft.com/office/word/2010/wordprocessingInk" xmlns:wne="http://schemas.microsoft.com/office/word/2006/wordml" xmlns:wps="http://schemas.microsoft.com/office/word/2010/wordprocessingShape" mc:Ignorable="w14 w15 w16se w16cid w16 w16cex w16sdtdh wp14">
+<w:endnotes xmlns:wpc="http://schemas.microsoft.com/office/word/2010/wordprocessingCanvas" xmlns:cx="http://schemas.microsoft.com/office/drawing/2014/chartex" xmlns:cx1="http://schemas.microsoft.com/office/drawing/2015/9/8/chartex" xmlns:cx2="http://schemas.microsoft.com/office/drawing/2015/10/21/chartex" xmlns:cx3="http://schemas.microsoft.com/office/drawing/2016/5/9/chartex" xmlns:cx4="http://schemas.microsoft.com/office/drawing/2016/5/10/chartex" xmlns:cx5="http://schemas.microsoft.com/office/drawing/2016/5/11/chartex" xmlns:cx6="http://schemas.microsoft.com/office/drawing/2016/5/12/chartex" xmlns:cx7="http://schemas.microsoft.com/office/drawing/2016/5/13/chartex" xmlns:cx8="http://schemas.microsoft.com/office/drawing/2016/5/14/chartex" xmlns:mc="http://schemas.openxmlformats.org/markup-compatibility/2006" xmlns:aink="http://schemas.microsoft.com/office/drawing/2016/ink" xmlns:am3d="http://schemas.microsoft.com/office/drawing/2017/model3d" xmlns:o="urn:schemas-microsoft-com:office:office" xmlns:oel="http://schemas.microsoft.com/office/2019/extlst" xmlns:r="http://schemas.openxmlformats.org/officeDocument/2006/relationships" xmlns:m="http://schemas.openxmlformats.org/officeDocument/2006/math" xmlns:v="urn:schemas-microsoft-com:vml" xmlns:wp14="http://schemas.microsoft.com/office/word/2010/wordprocessingDrawing" xmlns:wp="http://schemas.openxmlformats.org/drawingml/2006/wordprocessingDrawing" xmlns:w10="urn:schemas-microsoft-com:office:word" xmlns:w="http://schemas.openxmlformats.org/wordprocessingml/2006/main" xmlns:w14="http://schemas.microsoft.com/office/word/2010/wordml" xmlns:w15="http://schemas.microsoft.com/office/word/2012/wordml" xmlns:w16cex="http://schemas.microsoft.com/office/word/2018/wordml/cex" xmlns:w16cid="http://schemas.microsoft.com/office/word/2016/wordml/cid" xmlns:w16="http://schemas.microsoft.com/office/word/2018/wordml" xmlns:w16du="http://schemas.microsoft.com/office/word/2023/wordml/word16du" xmlns:w16sdtdh="http://schemas.microsoft.com/office/word/2020/wordml/sdtdatahash" xmlns:w16sdtfl="http://schemas.microsoft.com/office/word/2024/wordml/sdtformatlock" xmlns:w16se="http://schemas.microsoft.com/office/word/2015/wordml/symex" xmlns:wpg="http://schemas.microsoft.com/office/word/2010/wordprocessingGroup" xmlns:wpi="http://schemas.microsoft.com/office/word/2010/wordprocessingInk" xmlns:wne="http://schemas.microsoft.com/office/word/2006/wordml" xmlns:wps="http://schemas.microsoft.com/office/word/2010/wordprocessingShape" mc:Ignorable="w14 w15 w16se w16cid w16 w16cex w16sdtdh w16sdtfl w16du wp14">
   <w:endnote w:type="separator" w:id="-1">
     <w:p>
       <w:pPr>
@@ -413,7 +558,7 @@
 </file>
 
 <file path=word/footnotes.xml><?xml version="1.0" encoding="utf-8"?>
-<w:footnotes xmlns:wpc="http://schemas.microsoft.com/office/word/2010/wordprocessingCanvas" xmlns:cx="http://schemas.microsoft.com/office/drawing/2014/chartex" xmlns:cx1="http://schemas.microsoft.com/office/drawing/2015/9/8/chartex" xmlns:cx2="http://schemas.microsoft.com/office/drawing/2015/10/21/chartex" xmlns:cx3="http://schemas.microsoft.com/office/drawing/2016/5/9/chartex" xmlns:cx4="http://schemas.microsoft.com/office/drawing/2016/5/10/chartex" xmlns:cx5="http://schemas.microsoft.com/office/drawing/2016/5/11/chartex" xmlns:cx6="http://schemas.microsoft.com/office/drawing/2016/5/12/chartex" xmlns:cx7="http://schemas.microsoft.com/office/drawing/2016/5/13/chartex" xmlns:cx8="http://schemas.microsoft.com/office/drawing/2016/5/14/chartex" xmlns:mc="http://schemas.openxmlformats.org/markup-compatibility/2006" xmlns:aink="http://schemas.microsoft.com/office/drawing/2016/ink" xmlns:am3d="http://schemas.microsoft.com/office/drawing/2017/model3d" xmlns:o="urn:schemas-microsoft-com:office:office" xmlns:oel="http://schemas.microsoft.com/office/2019/extlst" xmlns:r="http://schemas.openxmlformats.org/officeDocument/2006/relationships" xmlns:m="http://schemas.openxmlformats.org/officeDocument/2006/math" xmlns:v="urn:schemas-microsoft-com:vml" xmlns:wp14="http://schemas.microsoft.com/office/word/2010/wordprocessingDrawing" xmlns:wp="http://schemas.openxmlformats.org/drawingml/2006/wordprocessingDrawing" xmlns:w10="urn:schemas-microsoft-com:office:word" xmlns:w="http://schemas.openxmlformats.org/wordprocessingml/2006/main" xmlns:w14="http://schemas.microsoft.com/office/word/2010/wordml" xmlns:w15="http://schemas.microsoft.com/office/word/2012/wordml" xmlns:w16cex="http://schemas.microsoft.com/office/word/2018/wordml/cex" xmlns:w16cid="http://schemas.microsoft.com/office/word/2016/wordml/cid" xmlns:w16="http://schemas.microsoft.com/office/word/2018/wordml" xmlns:w16sdtdh="http://schemas.microsoft.com/office/word/2020/wordml/sdtdatahash" xmlns:w16se="http://schemas.microsoft.com/office/word/2015/wordml/symex" xmlns:wpg="http://schemas.microsoft.com/office/word/2010/wordprocessingGroup" xmlns:wpi="http://schemas.microsoft.com/office/word/2010/wordprocessingInk" xmlns:wne="http://schemas.microsoft.com/office/word/2006/wordml" xmlns:wps="http://schemas.microsoft.com/office/word/2010/wordprocessingShape" mc:Ignorable="w14 w15 w16se w16cid w16 w16cex w16sdtdh wp14">
+<w:footnotes xmlns:wpc="http://schemas.microsoft.com/office/word/2010/wordprocessingCanvas" xmlns:cx="http://schemas.microsoft.com/office/drawing/2014/chartex" xmlns:cx1="http://schemas.microsoft.com/office/drawing/2015/9/8/chartex" xmlns:cx2="http://schemas.microsoft.com/office/drawing/2015/10/21/chartex" xmlns:cx3="http://schemas.microsoft.com/office/drawing/2016/5/9/chartex" xmlns:cx4="http://schemas.microsoft.com/office/drawing/2016/5/10/chartex" xmlns:cx5="http://schemas.microsoft.com/office/drawing/2016/5/11/chartex" xmlns:cx6="http://schemas.microsoft.com/office/drawing/2016/5/12/chartex" xmlns:cx7="http://schemas.microsoft.com/office/drawing/2016/5/13/chartex" xmlns:cx8="http://schemas.microsoft.com/office/drawing/2016/5/14/chartex" xmlns:mc="http://schemas.openxmlformats.org/markup-compatibility/2006" xmlns:aink="http://schemas.microsoft.com/office/drawing/2016/ink" xmlns:am3d="http://schemas.microsoft.com/office/drawing/2017/model3d" xmlns:o="urn:schemas-microsoft-com:office:office" xmlns:oel="http://schemas.microsoft.com/office/2019/extlst" xmlns:r="http://schemas.openxmlformats.org/officeDocument/2006/relationships" xmlns:m="http://schemas.openxmlformats.org/officeDocument/2006/math" xmlns:v="urn:schemas-microsoft-com:vml" xmlns:wp14="http://schemas.microsoft.com/office/word/2010/wordprocessingDrawing" xmlns:wp="http://schemas.openxmlformats.org/drawingml/2006/wordprocessingDrawing" xmlns:w10="urn:schemas-microsoft-com:office:word" xmlns:w="http://schemas.openxmlformats.org/wordprocessingml/2006/main" xmlns:w14="http://schemas.microsoft.com/office/word/2010/wordml" xmlns:w15="http://schemas.microsoft.com/office/word/2012/wordml" xmlns:w16cex="http://schemas.microsoft.com/office/word/2018/wordml/cex" xmlns:w16cid="http://schemas.microsoft.com/office/word/2016/wordml/cid" xmlns:w16="http://schemas.microsoft.com/office/word/2018/wordml" xmlns:w16du="http://schemas.microsoft.com/office/word/2023/wordml/word16du" xmlns:w16sdtdh="http://schemas.microsoft.com/office/word/2020/wordml/sdtdatahash" xmlns:w16sdtfl="http://schemas.microsoft.com/office/word/2024/wordml/sdtformatlock" xmlns:w16se="http://schemas.microsoft.com/office/word/2015/wordml/symex" xmlns:wpg="http://schemas.microsoft.com/office/word/2010/wordprocessingGroup" xmlns:wpi="http://schemas.microsoft.com/office/word/2010/wordprocessingInk" xmlns:wne="http://schemas.microsoft.com/office/word/2006/wordml" xmlns:wps="http://schemas.microsoft.com/office/word/2010/wordprocessingShape" mc:Ignorable="w14 w15 w16se w16cid w16 w16cex w16sdtdh w16sdtfl w16du wp14">
   <w:footnote w:type="separator" w:id="-1">
     <w:p>
       <w:pPr>
@@ -438,7 +583,7 @@
 </file>
 
 <file path=word/header1.xml><?xml version="1.0" encoding="utf-8"?>
-<w:hdr xmlns:wpc="http://schemas.microsoft.com/office/word/2010/wordprocessingCanvas" xmlns:cx="http://schemas.microsoft.com/office/drawing/2014/chartex" xmlns:cx1="http://schemas.microsoft.com/office/drawing/2015/9/8/chartex" xmlns:cx2="http://schemas.microsoft.com/office/drawing/2015/10/21/chartex" xmlns:cx3="http://schemas.microsoft.com/office/drawing/2016/5/9/chartex" xmlns:cx4="http://schemas.microsoft.com/office/drawing/2016/5/10/chartex" xmlns:cx5="http://schemas.microsoft.com/office/drawing/2016/5/11/chartex" xmlns:cx6="http://schemas.microsoft.com/office/drawing/2016/5/12/chartex" xmlns:cx7="http://schemas.microsoft.com/office/drawing/2016/5/13/chartex" xmlns:cx8="http://schemas.microsoft.com/office/drawing/2016/5/14/chartex" xmlns:mc="http://schemas.openxmlformats.org/markup-compatibility/2006" xmlns:aink="http://schemas.microsoft.com/office/drawing/2016/ink" xmlns:am3d="http://schemas.microsoft.com/office/drawing/2017/model3d" xmlns:o="urn:schemas-microsoft-com:office:office" xmlns:oel="http://schemas.microsoft.com/office/2019/extlst" xmlns:r="http://schemas.openxmlformats.org/officeDocument/2006/relationships" xmlns:m="http://schemas.openxmlformats.org/officeDocument/2006/math" xmlns:v="urn:schemas-microsoft-com:vml" xmlns:wp14="http://schemas.microsoft.com/office/word/2010/wordprocessingDrawing" xmlns:wp="http://schemas.openxmlformats.org/drawingml/2006/wordprocessingDrawing" xmlns:w10="urn:schemas-microsoft-com:office:word" xmlns:w="http://schemas.openxmlformats.org/wordprocessingml/2006/main" xmlns:w14="http://schemas.microsoft.com/office/word/2010/wordml" xmlns:w15="http://schemas.microsoft.com/office/word/2012/wordml" xmlns:w16cex="http://schemas.microsoft.com/office/word/2018/wordml/cex" xmlns:w16cid="http://schemas.microsoft.com/office/word/2016/wordml/cid" xmlns:w16="http://schemas.microsoft.com/office/word/2018/wordml" xmlns:w16sdtdh="http://schemas.microsoft.com/office/word/2020/wordml/sdtdatahash" xmlns:w16se="http://schemas.microsoft.com/office/word/2015/wordml/symex" xmlns:wpg="http://schemas.microsoft.com/office/word/2010/wordprocessingGroup" xmlns:wpi="http://schemas.microsoft.com/office/word/2010/wordprocessingInk" xmlns:wne="http://schemas.microsoft.com/office/word/2006/wordml" xmlns:wps="http://schemas.microsoft.com/office/word/2010/wordprocessingShape" mc:Ignorable="w14 w15 w16se w16cid w16 w16cex w16sdtdh wp14">
+<w:hdr xmlns:wpc="http://schemas.microsoft.com/office/word/2010/wordprocessingCanvas" xmlns:cx="http://schemas.microsoft.com/office/drawing/2014/chartex" xmlns:cx1="http://schemas.microsoft.com/office/drawing/2015/9/8/chartex" xmlns:cx2="http://schemas.microsoft.com/office/drawing/2015/10/21/chartex" xmlns:cx3="http://schemas.microsoft.com/office/drawing/2016/5/9/chartex" xmlns:cx4="http://schemas.microsoft.com/office/drawing/2016/5/10/chartex" xmlns:cx5="http://schemas.microsoft.com/office/drawing/2016/5/11/chartex" xmlns:cx6="http://schemas.microsoft.com/office/drawing/2016/5/12/chartex" xmlns:cx7="http://schemas.microsoft.com/office/drawing/2016/5/13/chartex" xmlns:cx8="http://schemas.microsoft.com/office/drawing/2016/5/14/chartex" xmlns:mc="http://schemas.openxmlformats.org/markup-compatibility/2006" xmlns:aink="http://schemas.microsoft.com/office/drawing/2016/ink" xmlns:am3d="http://schemas.microsoft.com/office/drawing/2017/model3d" xmlns:o="urn:schemas-microsoft-com:office:office" xmlns:oel="http://schemas.microsoft.com/office/2019/extlst" xmlns:r="http://schemas.openxmlformats.org/officeDocument/2006/relationships" xmlns:m="http://schemas.openxmlformats.org/officeDocument/2006/math" xmlns:v="urn:schemas-microsoft-com:vml" xmlns:wp14="http://schemas.microsoft.com/office/word/2010/wordprocessingDrawing" xmlns:wp="http://schemas.openxmlformats.org/drawingml/2006/wordprocessingDrawing" xmlns:w10="urn:schemas-microsoft-com:office:word" xmlns:w="http://schemas.openxmlformats.org/wordprocessingml/2006/main" xmlns:w14="http://schemas.microsoft.com/office/word/2010/wordml" xmlns:w15="http://schemas.microsoft.com/office/word/2012/wordml" xmlns:w16cex="http://schemas.microsoft.com/office/word/2018/wordml/cex" xmlns:w16cid="http://schemas.microsoft.com/office/word/2016/wordml/cid" xmlns:w16="http://schemas.microsoft.com/office/word/2018/wordml" xmlns:w16du="http://schemas.microsoft.com/office/word/2023/wordml/word16du" xmlns:w16sdtdh="http://schemas.microsoft.com/office/word/2020/wordml/sdtdatahash" xmlns:w16sdtfl="http://schemas.microsoft.com/office/word/2024/wordml/sdtformatlock" xmlns:w16se="http://schemas.microsoft.com/office/word/2015/wordml/symex" xmlns:wpg="http://schemas.microsoft.com/office/word/2010/wordprocessingGroup" xmlns:wpi="http://schemas.microsoft.com/office/word/2010/wordprocessingInk" xmlns:wne="http://schemas.microsoft.com/office/word/2006/wordml" xmlns:wps="http://schemas.microsoft.com/office/word/2010/wordprocessingShape" mc:Ignorable="w14 w15 w16se w16cid w16 w16cex w16sdtdh w16sdtfl w16du wp14">
   <w:p>
     <w:pPr>
       <w:pStyle w:val="Header"/>
@@ -480,7 +625,7 @@
 </file>
 
 <file path=word/numbering.xml><?xml version="1.0" encoding="utf-8"?>
-<w:numbering xmlns:wpc="http://schemas.microsoft.com/office/word/2010/wordprocessingCanvas" xmlns:cx="http://schemas.microsoft.com/office/drawing/2014/chartex" xmlns:cx1="http://schemas.microsoft.com/office/drawing/2015/9/8/chartex" xmlns:cx2="http://schemas.microsoft.com/office/drawing/2015/10/21/chartex" xmlns:cx3="http://schemas.microsoft.com/office/drawing/2016/5/9/chartex" xmlns:cx4="http://schemas.microsoft.com/office/drawing/2016/5/10/chartex" xmlns:cx5="http://schemas.microsoft.com/office/drawing/2016/5/11/chartex" xmlns:cx6="http://schemas.microsoft.com/office/drawing/2016/5/12/chartex" xmlns:cx7="http://schemas.microsoft.com/office/drawing/2016/5/13/chartex" xmlns:cx8="http://schemas.microsoft.com/office/drawing/2016/5/14/chartex" xmlns:mc="http://schemas.openxmlformats.org/markup-compatibility/2006" xmlns:aink="http://schemas.microsoft.com/office/drawing/2016/ink" xmlns:am3d="http://schemas.microsoft.com/office/drawing/2017/model3d" xmlns:o="urn:schemas-microsoft-com:office:office" xmlns:oel="http://schemas.microsoft.com/office/2019/extlst" xmlns:r="http://schemas.openxmlformats.org/officeDocument/2006/relationships" xmlns:m="http://schemas.openxmlformats.org/officeDocument/2006/math" xmlns:v="urn:schemas-microsoft-com:vml" xmlns:wp14="http://schemas.microsoft.com/office/word/2010/wordprocessingDrawing" xmlns:wp="http://schemas.openxmlformats.org/drawingml/2006/wordprocessingDrawing" xmlns:w10="urn:schemas-microsoft-com:office:word" xmlns:w="http://schemas.openxmlformats.org/wordprocessingml/2006/main" xmlns:w14="http://schemas.microsoft.com/office/word/2010/wordml" xmlns:w15="http://schemas.microsoft.com/office/word/2012/wordml" xmlns:w16cex="http://schemas.microsoft.com/office/word/2018/wordml/cex" xmlns:w16cid="http://schemas.microsoft.com/office/word/2016/wordml/cid" xmlns:w16="http://schemas.microsoft.com/office/word/2018/wordml" xmlns:w16sdtdh="http://schemas.microsoft.com/office/word/2020/wordml/sdtdatahash" xmlns:w16se="http://schemas.microsoft.com/office/word/2015/wordml/symex" xmlns:wpg="http://schemas.microsoft.com/office/word/2010/wordprocessingGroup" xmlns:wpi="http://schemas.microsoft.com/office/word/2010/wordprocessingInk" xmlns:wne="http://schemas.microsoft.com/office/word/2006/wordml" xmlns:wps="http://schemas.microsoft.com/office/word/2010/wordprocessingShape" mc:Ignorable="w14 w15 w16se w16cid w16 w16cex w16sdtdh wp14">
+<w:numbering xmlns:wpc="http://schemas.microsoft.com/office/word/2010/wordprocessingCanvas" xmlns:cx="http://schemas.microsoft.com/office/drawing/2014/chartex" xmlns:cx1="http://schemas.microsoft.com/office/drawing/2015/9/8/chartex" xmlns:cx2="http://schemas.microsoft.com/office/drawing/2015/10/21/chartex" xmlns:cx3="http://schemas.microsoft.com/office/drawing/2016/5/9/chartex" xmlns:cx4="http://schemas.microsoft.com/office/drawing/2016/5/10/chartex" xmlns:cx5="http://schemas.microsoft.com/office/drawing/2016/5/11/chartex" xmlns:cx6="http://schemas.microsoft.com/office/drawing/2016/5/12/chartex" xmlns:cx7="http://schemas.microsoft.com/office/drawing/2016/5/13/chartex" xmlns:cx8="http://schemas.microsoft.com/office/drawing/2016/5/14/chartex" xmlns:mc="http://schemas.openxmlformats.org/markup-compatibility/2006" xmlns:aink="http://schemas.microsoft.com/office/drawing/2016/ink" xmlns:am3d="http://schemas.microsoft.com/office/drawing/2017/model3d" xmlns:o="urn:schemas-microsoft-com:office:office" xmlns:oel="http://schemas.microsoft.com/office/2019/extlst" xmlns:r="http://schemas.openxmlformats.org/officeDocument/2006/relationships" xmlns:m="http://schemas.openxmlformats.org/officeDocument/2006/math" xmlns:v="urn:schemas-microsoft-com:vml" xmlns:wp14="http://schemas.microsoft.com/office/word/2010/wordprocessingDrawing" xmlns:wp="http://schemas.openxmlformats.org/drawingml/2006/wordprocessingDrawing" xmlns:w10="urn:schemas-microsoft-com:office:word" xmlns:w="http://schemas.openxmlformats.org/wordprocessingml/2006/main" xmlns:w14="http://schemas.microsoft.com/office/word/2010/wordml" xmlns:w15="http://schemas.microsoft.com/office/word/2012/wordml" xmlns:w16cex="http://schemas.microsoft.com/office/word/2018/wordml/cex" xmlns:w16cid="http://schemas.microsoft.com/office/word/2016/wordml/cid" xmlns:w16="http://schemas.microsoft.com/office/word/2018/wordml" xmlns:w16du="http://schemas.microsoft.com/office/word/2023/wordml/word16du" xmlns:w16sdtdh="http://schemas.microsoft.com/office/word/2020/wordml/sdtdatahash" xmlns:w16sdtfl="http://schemas.microsoft.com/office/word/2024/wordml/sdtformatlock" xmlns:w16se="http://schemas.microsoft.com/office/word/2015/wordml/symex" xmlns:wpg="http://schemas.microsoft.com/office/word/2010/wordprocessingGroup" xmlns:wpi="http://schemas.microsoft.com/office/word/2010/wordprocessingInk" xmlns:wne="http://schemas.microsoft.com/office/word/2006/wordml" xmlns:wps="http://schemas.microsoft.com/office/word/2010/wordprocessingShape" mc:Ignorable="w14 w15 w16se w16cid w16 w16cex w16sdtdh w16sdtfl w16du wp14">
   <w:abstractNum w:abstractNumId="0" w15:restartNumberingAfterBreak="0">
     <w:nsid w:val="36EE0469"/>
     <w:multiLevelType w:val="hybridMultilevel"/>
@@ -717,7 +862,7 @@
 </file>
 
 <file path=word/styles.xml><?xml version="1.0" encoding="utf-8"?>
-<w:styles xmlns:mc="http://schemas.openxmlformats.org/markup-compatibility/2006" xmlns:r="http://schemas.openxmlformats.org/officeDocument/2006/relationships" xmlns:w="http://schemas.openxmlformats.org/wordprocessingml/2006/main" xmlns:w14="http://schemas.microsoft.com/office/word/2010/wordml" xmlns:w15="http://schemas.microsoft.com/office/word/2012/wordml" xmlns:w16cex="http://schemas.microsoft.com/office/word/2018/wordml/cex" xmlns:w16cid="http://schemas.microsoft.com/office/word/2016/wordml/cid" xmlns:w16="http://schemas.microsoft.com/office/word/2018/wordml" xmlns:w16sdtdh="http://schemas.microsoft.com/office/word/2020/wordml/sdtdatahash" xmlns:w16se="http://schemas.microsoft.com/office/word/2015/wordml/symex" mc:Ignorable="w14 w15 w16se w16cid w16 w16cex w16sdtdh">
+<w:styles xmlns:mc="http://schemas.openxmlformats.org/markup-compatibility/2006" xmlns:r="http://schemas.openxmlformats.org/officeDocument/2006/relationships" xmlns:w="http://schemas.openxmlformats.org/wordprocessingml/2006/main" xmlns:w14="http://schemas.microsoft.com/office/word/2010/wordml" xmlns:w15="http://schemas.microsoft.com/office/word/2012/wordml" xmlns:w16cex="http://schemas.microsoft.com/office/word/2018/wordml/cex" xmlns:w16cid="http://schemas.microsoft.com/office/word/2016/wordml/cid" xmlns:w16="http://schemas.microsoft.com/office/word/2018/wordml" xmlns:w16du="http://schemas.microsoft.com/office/word/2023/wordml/word16du" xmlns:w16sdtdh="http://schemas.microsoft.com/office/word/2020/wordml/sdtdatahash" xmlns:w16sdtfl="http://schemas.microsoft.com/office/word/2024/wordml/sdtformatlock" xmlns:w16se="http://schemas.microsoft.com/office/word/2015/wordml/symex" mc:Ignorable="w14 w15 w16se w16cid w16 w16cex w16sdtdh w16sdtfl w16du">
   <w:docDefaults>
     <w:rPrDefault>
       <w:rPr>
@@ -1140,7 +1285,6 @@
   <w:style w:type="character" w:default="1" w:styleId="DefaultParagraphFont">
     <w:name w:val="Default Paragraph Font"/>
     <w:uiPriority w:val="1"/>
-    <w:semiHidden/>
     <w:unhideWhenUsed/>
   </w:style>
   <w:style w:type="table" w:default="1" w:styleId="TableNormal">

</xml_diff>